<commit_message>
Module 4 final commit
</commit_message>
<xml_diff>
--- a/python activities link.docx
+++ b/python activities link.docx
@@ -1301,10 +1301,160 @@
           </w:p>
           <w:p>
             <w:r>
+              <w:t>A2</w:t>
+            </w:r>
+          </w:p>
+        </w:tc>
+        <w:tc>
+          <w:tcPr>
+            <w:tcW w:w="8381" w:type="dxa"/>
+          </w:tcPr>
+          <w:p>
+            <w:r>
+              <w:t>https://github.com/saranyachandrasekar11/Python-Saranya/blob/00b1c5db57f0de3a2ca43215552db59ac3234a54/IntroPython/Module%203/M3L4/M3L4A2.py</w:t>
+            </w:r>
+          </w:p>
+        </w:tc>
+      </w:tr>
+      <w:tr>
+        <w:tc>
+          <w:tcPr>
+            <w:tcW w:w="635" w:type="dxa"/>
+          </w:tcPr>
+          <w:p>
+            <w:r>
+              <w:t>M4L4</w:t>
+            </w:r>
+          </w:p>
+          <w:p>
+            <w:r>
+              <w:t>A3</w:t>
+            </w:r>
+          </w:p>
+        </w:tc>
+        <w:tc>
+          <w:tcPr>
+            <w:tcW w:w="8381" w:type="dxa"/>
+          </w:tcPr>
+          <w:p>
+            <w:r>
+              <w:t>https://github.com/saranyachandrasekar11/Python-Saranya/blob/00b1c5db57f0de3a2ca43215552db59ac3234a54/IntroPython/Module%203/M3L4/M3L4A3.py</w:t>
+            </w:r>
+          </w:p>
+        </w:tc>
+      </w:tr>
+      <w:tr>
+        <w:tc>
+          <w:tcPr>
+            <w:tcW w:w="635" w:type="dxa"/>
+          </w:tcPr>
+          <w:p>
+            <w:r>
+              <w:t>M4L4</w:t>
+            </w:r>
+          </w:p>
+          <w:p>
+            <w:r>
+              <w:t>ACP</w:t>
+            </w:r>
+          </w:p>
+        </w:tc>
+        <w:tc>
+          <w:tcPr>
+            <w:tcW w:w="8381" w:type="dxa"/>
+          </w:tcPr>
+          <w:p>
+            <w:r>
+              <w:t>https://github.com/saranyachandrasekar11/Python-Saranya/blob/00b1c5db57f0de3a2ca43215552db59ac3234a54/IntroPython/Module%203/M3L4/M3L4ACP.py</w:t>
+            </w:r>
+          </w:p>
+        </w:tc>
+      </w:tr>
+      <w:tr>
+        <w:tc>
+          <w:tcPr>
+            <w:tcW w:w="635" w:type="dxa"/>
+          </w:tcPr>
+          <w:p>
+            <w:r>
+              <w:t>M4</w:t>
+            </w:r>
+          </w:p>
+          <w:p>
+            <w:r>
+              <w:t>L5</w:t>
+            </w:r>
+          </w:p>
+          <w:p>
+            <w:r>
+              <w:t>A1</w:t>
+            </w:r>
+          </w:p>
+        </w:tc>
+        <w:tc>
+          <w:tcPr>
+            <w:tcW w:w="8381" w:type="dxa"/>
+          </w:tcPr>
+          <w:p>
+            <w:r>
+              <w:t>https://github.com/saranyachandrasekar11/Python-Saranya/blob/00b1c5db57f0de3a2ca43215552db59ac3234a54/IntroPython/Module%203/M3L5/M3L5A1.py</w:t>
+            </w:r>
+          </w:p>
+        </w:tc>
+      </w:tr>
+      <w:tr>
+        <w:tc>
+          <w:tcPr>
+            <w:tcW w:w="635" w:type="dxa"/>
+          </w:tcPr>
+          <w:p>
+            <w:r>
+              <w:t>M4</w:t>
+            </w:r>
+          </w:p>
+          <w:p>
+            <w:r>
+              <w:t>L5</w:t>
+            </w:r>
+          </w:p>
+          <w:p>
+            <w:r>
+              <w:t>A2</w:t>
+            </w:r>
+          </w:p>
+        </w:tc>
+        <w:tc>
+          <w:tcPr>
+            <w:tcW w:w="8381" w:type="dxa"/>
+          </w:tcPr>
+          <w:p>
+            <w:r>
+              <w:t>https://github.com/saranyachandrasekar11/Python-Saranya/blob/00b1c5db57f0de3a2ca43215552db59ac3234a54/IntroPython/Module%203/M3L5/M3L5A2.py</w:t>
+            </w:r>
+          </w:p>
+        </w:tc>
+      </w:tr>
+      <w:tr>
+        <w:tc>
+          <w:tcPr>
+            <w:tcW w:w="635" w:type="dxa"/>
+          </w:tcPr>
+          <w:p>
+            <w:r>
+              <w:t>M4</w:t>
+            </w:r>
+          </w:p>
+          <w:p>
+            <w:r>
+              <w:t>L5</w:t>
+            </w:r>
+          </w:p>
+          <w:p>
+            <w:r>
               <w:t>A</w:t>
             </w:r>
             <w:r>
-              <w:t>2</w:t>
+              <w:t>3</w:t>
             </w:r>
           </w:p>
         </w:tc>
@@ -1314,7 +1464,7 @@
           </w:tcPr>
           <w:p>
             <w:r>
-              <w:t>https://github.com/saranyachandrasekar11/Python-Saranya/blob/00b1c5db57f0de3a2ca43215552db59ac3234a54/IntroPython/Module%203/M3L4/M3L4A2.py</w:t>
+              <w:t>https://github.com/saranyachandrasekar11/Python-Saranya/blob/00b1c5db57f0de3a2ca43215552db59ac3234a54/IntroPython/Module%203/M3L5/M3L5A3.py</w:t>
             </w:r>
           </w:p>
         </w:tc>
@@ -1326,15 +1476,17 @@
           </w:tcPr>
           <w:p>
             <w:r>
-              <w:t>M4L4</w:t>
-            </w:r>
-          </w:p>
-          <w:p>
-            <w:r>
-              <w:t>A</w:t>
-            </w:r>
-            <w:r>
-              <w:t>3</w:t>
+              <w:t>M4</w:t>
+            </w:r>
+          </w:p>
+          <w:p>
+            <w:r>
+              <w:t>L5</w:t>
+            </w:r>
+          </w:p>
+          <w:p>
+            <w:r>
+              <w:t>ACP</w:t>
             </w:r>
           </w:p>
         </w:tc>
@@ -1344,7 +1496,7 @@
           </w:tcPr>
           <w:p>
             <w:r>
-              <w:t>https://github.com/saranyachandrasekar11/Python-Saranya/blob/00b1c5db57f0de3a2ca43215552db59ac3234a54/IntroPython/Module%203/M3L4/M3L4A3.py</w:t>
+              <w:t>https://github.com/saranyachandrasekar11/Python-Saranya/blob/00b1c5db57f0de3a2ca43215552db59ac3234a54/IntroPython/Module%203/M3L5/M3L5ACP.py</w:t>
             </w:r>
           </w:p>
         </w:tc>
@@ -1356,15 +1508,17 @@
           </w:tcPr>
           <w:p>
             <w:r>
-              <w:t>M4L4</w:t>
-            </w:r>
-          </w:p>
-          <w:p>
-            <w:r>
-              <w:t>A</w:t>
-            </w:r>
-            <w:r>
-              <w:t>CP</w:t>
+              <w:t>M4</w:t>
+            </w:r>
+          </w:p>
+          <w:p>
+            <w:r>
+              <w:t>L6</w:t>
+            </w:r>
+          </w:p>
+          <w:p>
+            <w:r>
+              <w:t>A1</w:t>
             </w:r>
           </w:p>
         </w:tc>
@@ -1374,7 +1528,7 @@
           </w:tcPr>
           <w:p>
             <w:r>
-              <w:t>https://github.com/saranyachandrasekar11/Python-Saranya/blob/00b1c5db57f0de3a2ca43215552db59ac3234a54/IntroPython/Module%203/M3L4/M3L4ACP.py</w:t>
+              <w:t>https://github.com/saranyachandrasekar11/Python-Saranya/blob/00b1c5db57f0de3a2ca43215552db59ac3234a54/IntroPython/Module%203/M3L6/M3L6A1.py</w:t>
             </w:r>
           </w:p>
         </w:tc>
@@ -1391,12 +1545,12 @@
           </w:p>
           <w:p>
             <w:r>
-              <w:t>L5</w:t>
-            </w:r>
-          </w:p>
-          <w:p>
-            <w:r>
-              <w:t>A1</w:t>
+              <w:t>L6</w:t>
+            </w:r>
+          </w:p>
+          <w:p>
+            <w:r>
+              <w:t>A2</w:t>
             </w:r>
           </w:p>
         </w:tc>
@@ -1406,7 +1560,7 @@
           </w:tcPr>
           <w:p>
             <w:r>
-              <w:t>https://github.com/saranyachandrasekar11/Python-Saranya/blob/00b1c5db57f0de3a2ca43215552db59ac3234a54/IntroPython/Module%203/M3L5/M3L5A1.py</w:t>
+              <w:t>https://github.com/saranyachandrasekar11/Python-Saranya/blob/00b1c5db57f0de3a2ca43215552db59ac3234a54/IntroPython/Module%203/M3L6/M3L6A2.py</w:t>
             </w:r>
           </w:p>
         </w:tc>
@@ -1423,15 +1577,12 @@
           </w:p>
           <w:p>
             <w:r>
-              <w:t>L5</w:t>
-            </w:r>
-          </w:p>
-          <w:p>
-            <w:r>
-              <w:t>A</w:t>
-            </w:r>
-            <w:r>
-              <w:t>2</w:t>
+              <w:t>L6</w:t>
+            </w:r>
+          </w:p>
+          <w:p>
+            <w:r>
+              <w:t>A3</w:t>
             </w:r>
           </w:p>
         </w:tc>
@@ -1441,7 +1592,7 @@
           </w:tcPr>
           <w:p>
             <w:r>
-              <w:t>https://github.com/saranyachandrasekar11/Python-Saranya/blob/00b1c5db57f0de3a2ca43215552db59ac3234a54/IntroPython/Module%203/M3L5/M3L5A2.py</w:t>
+              <w:t>https://github.com/saranyachandrasekar11/Python-Saranya/blob/00b1c5db57f0de3a2ca43215552db59ac3234a54/IntroPython/Module%203/M3L6/M3l6A3.py</w:t>
             </w:r>
           </w:p>
         </w:tc>
@@ -1458,15 +1609,12 @@
           </w:p>
           <w:p>
             <w:r>
-              <w:t>L5</w:t>
-            </w:r>
-          </w:p>
-          <w:p>
-            <w:r>
-              <w:t>A</w:t>
-            </w:r>
-            <w:r>
-              <w:t>3</w:t>
+              <w:t>L6</w:t>
+            </w:r>
+          </w:p>
+          <w:p>
+            <w:r>
+              <w:t>ACP</w:t>
             </w:r>
           </w:p>
         </w:tc>
@@ -1476,181 +1624,110 @@
           </w:tcPr>
           <w:p>
             <w:r>
-              <w:t>https://github.com/saranyachandrasekar11/Python-Saranya/blob/00b1c5db57f0de3a2ca43215552db59ac3234a54/IntroPython/Module%203/M3L5/M3L5A3.py</w:t>
-            </w:r>
-          </w:p>
-        </w:tc>
-      </w:tr>
-      <w:tr>
-        <w:tc>
-          <w:tcPr>
-            <w:tcW w:w="635" w:type="dxa"/>
-          </w:tcPr>
-          <w:p>
-            <w:r>
-              <w:t>M4</w:t>
-            </w:r>
-          </w:p>
-          <w:p>
-            <w:r>
-              <w:t>L5</w:t>
-            </w:r>
-          </w:p>
-          <w:p>
-            <w:r>
-              <w:t>A</w:t>
-            </w:r>
-            <w:r>
-              <w:t>CP</w:t>
-            </w:r>
-          </w:p>
-        </w:tc>
-        <w:tc>
-          <w:tcPr>
-            <w:tcW w:w="8381" w:type="dxa"/>
-          </w:tcPr>
-          <w:p>
-            <w:r>
-              <w:t>https://github.com/saranyachandrasekar11/Python-Saranya/blob/00b1c5db57f0de3a2ca43215552db59ac3234a54/IntroPython/Module%203/M3L5/M3L5ACP.py</w:t>
-            </w:r>
-          </w:p>
-        </w:tc>
-      </w:tr>
-      <w:tr>
-        <w:tc>
-          <w:tcPr>
-            <w:tcW w:w="635" w:type="dxa"/>
-          </w:tcPr>
-          <w:p>
-            <w:r>
-              <w:t>M4</w:t>
-            </w:r>
-          </w:p>
-          <w:p>
-            <w:r>
-              <w:t>L6</w:t>
-            </w:r>
-          </w:p>
-          <w:p>
-            <w:r>
-              <w:t>A1</w:t>
-            </w:r>
-          </w:p>
-        </w:tc>
-        <w:tc>
-          <w:tcPr>
-            <w:tcW w:w="8381" w:type="dxa"/>
-          </w:tcPr>
-          <w:p>
-            <w:r>
-              <w:t>https://github.com/saranyachandrasekar11/Python-Saranya/blob/00b1c5db57f0de3a2ca43215552db59ac3234a54/IntroPython/Module%203/M3L6/M3L6A1.py</w:t>
-            </w:r>
-          </w:p>
-        </w:tc>
-      </w:tr>
-      <w:tr>
-        <w:tc>
-          <w:tcPr>
-            <w:tcW w:w="635" w:type="dxa"/>
-          </w:tcPr>
-          <w:p>
-            <w:r>
-              <w:t>M4</w:t>
-            </w:r>
-          </w:p>
-          <w:p>
-            <w:r>
-              <w:t>L6</w:t>
-            </w:r>
-          </w:p>
-          <w:p>
-            <w:r>
-              <w:t>A</w:t>
-            </w:r>
-            <w:r>
-              <w:t>2</w:t>
-            </w:r>
-          </w:p>
-        </w:tc>
-        <w:tc>
-          <w:tcPr>
-            <w:tcW w:w="8381" w:type="dxa"/>
-          </w:tcPr>
-          <w:p>
-            <w:r>
-              <w:t>https://github.com/saranyachandrasekar11/Python-Saranya/blob/00b1c5db57f0de3a2ca43215552db59ac3234a54/IntroPython/Module%203/M3L6/M3L6A2.py</w:t>
-            </w:r>
-          </w:p>
-        </w:tc>
-      </w:tr>
-      <w:tr>
-        <w:tc>
-          <w:tcPr>
-            <w:tcW w:w="635" w:type="dxa"/>
-          </w:tcPr>
-          <w:p>
-            <w:r>
-              <w:t>M4</w:t>
-            </w:r>
-          </w:p>
-          <w:p>
-            <w:r>
-              <w:t>L6</w:t>
-            </w:r>
-          </w:p>
-          <w:p>
-            <w:r>
-              <w:t>A</w:t>
-            </w:r>
-            <w:r>
-              <w:t>3</w:t>
-            </w:r>
-          </w:p>
-        </w:tc>
-        <w:tc>
-          <w:tcPr>
-            <w:tcW w:w="8381" w:type="dxa"/>
-          </w:tcPr>
-          <w:p>
-            <w:r>
-              <w:t>https://github.com/saranyachandrasekar11/Python-Saranya/blob/00b1c5db57f0de3a2ca43215552db59ac3234a54/IntroPython/Module%203/M3L6/M3l6A3.py</w:t>
-            </w:r>
-          </w:p>
-        </w:tc>
-      </w:tr>
-      <w:tr>
-        <w:tc>
-          <w:tcPr>
-            <w:tcW w:w="635" w:type="dxa"/>
-          </w:tcPr>
-          <w:p>
-            <w:r>
-              <w:t>M4</w:t>
-            </w:r>
-          </w:p>
-          <w:p>
-            <w:r>
-              <w:t>L6</w:t>
-            </w:r>
-          </w:p>
-          <w:p>
-            <w:r>
-              <w:t>A</w:t>
-            </w:r>
-            <w:r>
-              <w:t>CP</w:t>
-            </w:r>
-          </w:p>
-        </w:tc>
-        <w:tc>
-          <w:tcPr>
-            <w:tcW w:w="8381" w:type="dxa"/>
-          </w:tcPr>
-          <w:p>
-            <w:r>
               <w:t>https://github.com/saranyachandrasekar11/Python-Saranya/blob/00b1c5db57f0de3a2ca43215552db59ac3234a54/IntroPython/Module%203/M3L6/M3L6ACP.py</w:t>
             </w:r>
           </w:p>
+        </w:tc>
+      </w:tr>
+    </w:tbl>
+    <w:p/>
+    <w:p/>
+    <w:tbl>
+      <w:tblPr>
+        <w:tblStyle w:val="TableGrid"/>
+        <w:tblW w:w="0" w:type="auto"/>
+        <w:tblLook w:val="04A0" w:firstRow="1" w:lastRow="0" w:firstColumn="1" w:lastColumn="0" w:noHBand="0" w:noVBand="1"/>
+      </w:tblPr>
+      <w:tblGrid>
+        <w:gridCol w:w="805"/>
+        <w:gridCol w:w="8211"/>
+      </w:tblGrid>
+      <w:tr>
+        <w:tc>
+          <w:tcPr>
+            <w:tcW w:w="805" w:type="dxa"/>
+          </w:tcPr>
+          <w:p>
+            <w:r>
+              <w:t>M5 L1 A1</w:t>
+            </w:r>
+          </w:p>
+        </w:tc>
+        <w:tc>
+          <w:tcPr>
+            <w:tcW w:w="8211" w:type="dxa"/>
+          </w:tcPr>
+          <w:p/>
+        </w:tc>
+      </w:tr>
+      <w:tr>
+        <w:tc>
+          <w:tcPr>
+            <w:tcW w:w="805" w:type="dxa"/>
+          </w:tcPr>
+          <w:p/>
+        </w:tc>
+        <w:tc>
+          <w:tcPr>
+            <w:tcW w:w="8211" w:type="dxa"/>
+          </w:tcPr>
+          <w:p/>
+        </w:tc>
+      </w:tr>
+      <w:tr>
+        <w:tc>
+          <w:tcPr>
+            <w:tcW w:w="805" w:type="dxa"/>
+          </w:tcPr>
+          <w:p/>
+        </w:tc>
+        <w:tc>
+          <w:tcPr>
+            <w:tcW w:w="8211" w:type="dxa"/>
+          </w:tcPr>
+          <w:p/>
+        </w:tc>
+      </w:tr>
+      <w:tr>
+        <w:tc>
+          <w:tcPr>
+            <w:tcW w:w="805" w:type="dxa"/>
+          </w:tcPr>
+          <w:p/>
+        </w:tc>
+        <w:tc>
+          <w:tcPr>
+            <w:tcW w:w="8211" w:type="dxa"/>
+          </w:tcPr>
+          <w:p/>
+        </w:tc>
+      </w:tr>
+      <w:tr>
+        <w:tc>
+          <w:tcPr>
+            <w:tcW w:w="805" w:type="dxa"/>
+          </w:tcPr>
+          <w:p/>
+        </w:tc>
+        <w:tc>
+          <w:tcPr>
+            <w:tcW w:w="8211" w:type="dxa"/>
+          </w:tcPr>
+          <w:p/>
+        </w:tc>
+      </w:tr>
+      <w:tr>
+        <w:tc>
+          <w:tcPr>
+            <w:tcW w:w="805" w:type="dxa"/>
+          </w:tcPr>
+          <w:p/>
+        </w:tc>
+        <w:tc>
+          <w:tcPr>
+            <w:tcW w:w="8211" w:type="dxa"/>
+          </w:tcPr>
+          <w:p/>
         </w:tc>
       </w:tr>
     </w:tbl>

</xml_diff>